<commit_message>
Added comment to documentation
</commit_message>
<xml_diff>
--- a/module-1/documentation.docx
+++ b/module-1/documentation.docx
@@ -157,6 +157,20 @@
           </w:r>
         </w:sdtContent>
       </w:sdt>
+    </w:p>
+    <w:p>
+      <w:pPr>
+        <w:pStyle w:val="Heading2"/>
+        <w:spacing w:line="360" w:lineRule="auto"/>
+      </w:pPr>
+      <w:r>
+        <w:t>Comments</w:t>
+      </w:r>
+    </w:p>
+    <w:p>
+      <w:r>
+        <w:t>My JavaFX – Random Cards Display assignment was created with the use of IntelliJ’s project method, so that will be one of the reason why the files are located in many subdirectories.</w:t>
+      </w:r>
     </w:p>
     <w:p>
       <w:pPr>
@@ -221,13 +235,7 @@
         <w:spacing w:line="360" w:lineRule="auto"/>
       </w:pPr>
       <w:r>
-        <w:t>Java</w:t>
-      </w:r>
-      <w:r>
-        <w:t xml:space="preserve">FX </w:t>
-      </w:r>
-      <w:r>
-        <w:t>Validation</w:t>
+        <w:t>JavaFX Validation</w:t>
       </w:r>
     </w:p>
     <w:p>
@@ -5365,6 +5373,7 @@
     <w:rsid w:val="0035048C"/>
     <w:rsid w:val="003D3A08"/>
     <w:rsid w:val="0041734A"/>
+    <w:rsid w:val="00567A8F"/>
     <w:rsid w:val="006874B6"/>
     <w:rsid w:val="0074638B"/>
     <w:rsid w:val="008013C5"/>

</xml_diff>